<commit_message>
Final 1.docx + url
</commit_message>
<xml_diff>
--- a/1.docx
+++ b/1.docx
@@ -2387,35 +2387,6 @@
           <w:rFonts w:ascii="Times New Roman" w:hAnsi="Times New Roman" w:cs="Times New Roman"/>
           <w:sz w:val="28"/>
           <w:szCs w:val="28"/>
-        </w:rPr>
-      </w:pPr>
-      <w:r>
-        <w:rPr>
-          <w:rFonts w:ascii="Times New Roman" w:hAnsi="Times New Roman" w:cs="Times New Roman"/>
-          <w:sz w:val="28"/>
-          <w:szCs w:val="28"/>
-        </w:rPr>
-        <w:t xml:space="preserve">Ссылка на репозиторий: </w:t>
-      </w:r>
-      <w:hyperlink r:id="rId21" w:history="1">
-        <w:r>
-          <w:rPr>
-            <w:rStyle w:val="ac"/>
-            <w:rFonts w:ascii="Times New Roman" w:hAnsi="Times New Roman" w:cs="Times New Roman"/>
-            <w:sz w:val="28"/>
-            <w:szCs w:val="28"/>
-          </w:rPr>
-          <w:t>https://github.com/iSweenDyy/FinalWork</w:t>
-        </w:r>
-      </w:hyperlink>
-    </w:p>
-    <w:p>
-      <w:pPr>
-        <w:jc w:val="both"/>
-        <w:rPr>
-          <w:rFonts w:ascii="Times New Roman" w:hAnsi="Times New Roman" w:cs="Times New Roman"/>
-          <w:sz w:val="28"/>
-          <w:szCs w:val="28"/>
           <w:lang w:val="en-US"/>
         </w:rPr>
       </w:pPr>
@@ -2442,7 +2413,7 @@
                     <pic:cNvPicPr/>
                   </pic:nvPicPr>
                   <pic:blipFill>
-                    <a:blip r:embed="rId22"/>
+                    <a:blip r:embed="rId21"/>
                     <a:stretch>
                       <a:fillRect/>
                     </a:stretch>
@@ -2472,6 +2443,119 @@
           <w:szCs w:val="28"/>
         </w:rPr>
       </w:pPr>
+      <w:r>
+        <w:rPr>
+          <w:rFonts w:ascii="Times New Roman" w:hAnsi="Times New Roman" w:cs="Times New Roman"/>
+          <w:sz w:val="28"/>
+          <w:szCs w:val="28"/>
+        </w:rPr>
+        <w:t xml:space="preserve">Ссылка на репозиторий: </w:t>
+      </w:r>
+      <w:hyperlink r:id="rId22" w:history="1">
+        <w:r>
+          <w:rPr>
+            <w:rStyle w:val="ac"/>
+            <w:rFonts w:ascii="Times New Roman" w:hAnsi="Times New Roman" w:cs="Times New Roman"/>
+            <w:sz w:val="28"/>
+            <w:szCs w:val="28"/>
+          </w:rPr>
+          <w:t>https://github.com/iSweenDyy/FinalWork</w:t>
+        </w:r>
+      </w:hyperlink>
+    </w:p>
+    <w:p>
+      <w:pPr>
+        <w:jc w:val="both"/>
+        <w:rPr>
+          <w:rFonts w:ascii="Times New Roman" w:hAnsi="Times New Roman" w:cs="Times New Roman"/>
+          <w:sz w:val="28"/>
+          <w:szCs w:val="28"/>
+        </w:rPr>
+      </w:pPr>
+      <w:r>
+        <w:rPr>
+          <w:rFonts w:ascii="Times New Roman" w:hAnsi="Times New Roman" w:cs="Times New Roman"/>
+          <w:sz w:val="28"/>
+          <w:szCs w:val="28"/>
+        </w:rPr>
+        <w:lastRenderedPageBreak/>
+        <w:t>Вывод</w:t>
+      </w:r>
+      <w:r>
+        <w:rPr>
+          <w:rFonts w:ascii="Times New Roman" w:hAnsi="Times New Roman" w:cs="Times New Roman"/>
+          <w:sz w:val="28"/>
+          <w:szCs w:val="28"/>
+        </w:rPr>
+        <w:t>:</w:t>
+      </w:r>
+      <w:r>
+        <w:rPr>
+          <w:rFonts w:ascii="CIDFont+F2" w:hAnsi="CIDFont+F2" w:cs="CIDFont+F2"/>
+          <w:kern w:val="0"/>
+          <w:sz w:val="28"/>
+          <w:szCs w:val="28"/>
+        </w:rPr>
+        <w:t xml:space="preserve"> </w:t>
+      </w:r>
+      <w:r>
+        <w:rPr>
+          <w:rFonts w:ascii="Times New Roman" w:hAnsi="Times New Roman" w:cs="Times New Roman"/>
+          <w:sz w:val="28"/>
+          <w:szCs w:val="28"/>
+        </w:rPr>
+        <w:t>научи</w:t>
+      </w:r>
+      <w:r>
+        <w:rPr>
+          <w:rFonts w:ascii="Times New Roman" w:hAnsi="Times New Roman" w:cs="Times New Roman"/>
+          <w:sz w:val="28"/>
+          <w:szCs w:val="28"/>
+        </w:rPr>
+        <w:t>лись</w:t>
+      </w:r>
+      <w:r>
+        <w:rPr>
+          <w:rFonts w:ascii="Times New Roman" w:hAnsi="Times New Roman" w:cs="Times New Roman"/>
+          <w:sz w:val="28"/>
+          <w:szCs w:val="28"/>
+        </w:rPr>
+        <w:t xml:space="preserve"> работать с веб-сервисом для хостинга проектов и их</w:t>
+      </w:r>
+    </w:p>
+    <w:p>
+      <w:pPr>
+        <w:jc w:val="both"/>
+        <w:rPr>
+          <w:rFonts w:ascii="Times New Roman" w:hAnsi="Times New Roman" w:cs="Times New Roman"/>
+          <w:sz w:val="28"/>
+          <w:szCs w:val="28"/>
+        </w:rPr>
+      </w:pPr>
+      <w:r>
+        <w:rPr>
+          <w:rFonts w:ascii="Times New Roman" w:hAnsi="Times New Roman" w:cs="Times New Roman"/>
+          <w:sz w:val="28"/>
+          <w:szCs w:val="28"/>
+        </w:rPr>
+        <w:t>совместной разработки GitHub. Созда</w:t>
+      </w:r>
+      <w:r>
+        <w:rPr>
+          <w:rFonts w:ascii="Times New Roman" w:hAnsi="Times New Roman" w:cs="Times New Roman"/>
+          <w:sz w:val="28"/>
+          <w:szCs w:val="28"/>
+        </w:rPr>
+        <w:t>ли</w:t>
+      </w:r>
+      <w:r>
+        <w:rPr>
+          <w:rFonts w:ascii="Times New Roman" w:hAnsi="Times New Roman" w:cs="Times New Roman"/>
+          <w:sz w:val="28"/>
+          <w:szCs w:val="28"/>
+        </w:rPr>
+        <w:t xml:space="preserve"> свой публичный репозиторий.</w:t>
+      </w:r>
     </w:p>
     <w:p>
       <w:pPr>

</xml_diff>